<commit_message>
feat: per-trainer devis engine
</commit_message>
<xml_diff>
--- a/data/missions/b6297879e2dd_demande.docx
+++ b/data/missions/b6297879e2dd_demande.docx
@@ -62,7 +62,7 @@
           <w:sz w:val="19"/>
           <w:lang w:val="fr-FR"/>
         </w:rPr>
-        <w:t>Le 22/07/2026</w:t>
+        <w:t>Le 23/07/2026</w:t>
       </w:r>
     </w:p>
     <w:p>
@@ -78,7 +78,7 @@
           <w:sz w:val="21"/>
           <w:lang w:val="fr-FR"/>
         </w:rPr>
-        <w:t>À l'attention de Anna,</w:t>
+        <w:t>À l'attention de Leone,</w:t>
       </w:r>
     </w:p>
     <w:p>

</xml_diff>